<commit_message>
docs: actualizar documento de diseño con Adenda v5 (UI, PDF, carrusel y pesos)
</commit_message>
<xml_diff>
--- a/Sistema_Multiagente_Reclutamiento_v4_actualizado.docx
+++ b/Sistema_Multiagente_Reclutamiento_v4_actualizado.docx
@@ -382,24 +382,7 @@
           </w:tcPr>
           <w:p>
             <w:r>
-              <w:rPr>
-                <w:i/>
-                <w:iCs/>
-                <w:color w:val="64748B"/>
-                <w:sz w:val="20"/>
-                <w:szCs w:val="20"/>
-              </w:rPr>
-              <w:t>2</w:t>
-            </w:r>
-            <w:r>
-              <w:rPr>
-                <w:i/>
-                <w:iCs/>
-                <w:color w:val="64748B"/>
-                <w:sz w:val="20"/>
-                <w:szCs w:val="20"/>
-              </w:rPr>
-              <w:t>.0</w:t>
+              <w:t>5.0</w:t>
             </w:r>
           </w:p>
         </w:tc>
@@ -1119,12 +1102,7 @@
           </w:tcPr>
           <w:p>
             <w:r>
-              <w:rPr>
-                <w:color w:val="334155"/>
-                <w:sz w:val="20"/>
-                <w:szCs w:val="20"/>
-              </w:rPr>
-              <w:t xml:space="preserve"> </w:t>
+              <w:t>3.0</w:t>
             </w:r>
           </w:p>
         </w:tc>
@@ -1148,12 +1126,7 @@
           </w:tcPr>
           <w:p>
             <w:r>
-              <w:rPr>
-                <w:color w:val="334155"/>
-                <w:sz w:val="20"/>
-                <w:szCs w:val="20"/>
-              </w:rPr>
-              <w:t xml:space="preserve"> </w:t>
+              <w:t>22/06/2026</w:t>
             </w:r>
           </w:p>
         </w:tc>
@@ -1177,12 +1150,7 @@
           </w:tcPr>
           <w:p>
             <w:r>
-              <w:rPr>
-                <w:color w:val="334155"/>
-                <w:sz w:val="20"/>
-                <w:szCs w:val="20"/>
-              </w:rPr>
-              <w:t xml:space="preserve"> </w:t>
+              <w:t>Grupo 04</w:t>
             </w:r>
           </w:p>
         </w:tc>
@@ -1206,12 +1174,91 @@
           </w:tcPr>
           <w:p>
             <w:r>
-              <w:rPr>
-                <w:color w:val="334155"/>
-                <w:sz w:val="20"/>
-                <w:szCs w:val="20"/>
-              </w:rPr>
-              <w:t xml:space="preserve"> </w:t>
+              <w:t>Documentación v3 de diseño y especificaciones base de la arquitectura.</w:t>
+            </w:r>
+          </w:p>
+        </w:tc>
+      </w:tr>
+      <w:tr>
+        <w:tc>
+          <w:tcPr>
+            <w:tcW w:type="dxa" w:w="1200"/>
+          </w:tcPr>
+          <w:p>
+            <w:r>
+              <w:t>4.0</w:t>
+            </w:r>
+          </w:p>
+        </w:tc>
+        <w:tc>
+          <w:tcPr>
+            <w:tcW w:type="dxa" w:w="1700"/>
+          </w:tcPr>
+          <w:p>
+            <w:r>
+              <w:t>08/07/2026</w:t>
+            </w:r>
+          </w:p>
+        </w:tc>
+        <w:tc>
+          <w:tcPr>
+            <w:tcW w:type="dxa" w:w="2400"/>
+          </w:tcPr>
+          <w:p>
+            <w:r>
+              <w:t>Grupo 04</w:t>
+            </w:r>
+          </w:p>
+        </w:tc>
+        <w:tc>
+          <w:tcPr>
+            <w:tcW w:type="dxa" w:w="3726"/>
+          </w:tcPr>
+          <w:p>
+            <w:r>
+              <w:t>Adenda v4: Cierre de brechas de implementación (RAG con BM25, observabilidad con LangSmith, 12 pruebas unitarias locales en pytest y pipeline de CI/CD).</w:t>
+            </w:r>
+          </w:p>
+        </w:tc>
+      </w:tr>
+      <w:tr>
+        <w:tc>
+          <w:tcPr>
+            <w:tcW w:type="dxa" w:w="1200"/>
+          </w:tcPr>
+          <w:p>
+            <w:r>
+              <w:t>5.0</w:t>
+            </w:r>
+          </w:p>
+        </w:tc>
+        <w:tc>
+          <w:tcPr>
+            <w:tcW w:type="dxa" w:w="1700"/>
+          </w:tcPr>
+          <w:p>
+            <w:r>
+              <w:t>08/07/2026</w:t>
+            </w:r>
+          </w:p>
+        </w:tc>
+        <w:tc>
+          <w:tcPr>
+            <w:tcW w:type="dxa" w:w="2400"/>
+          </w:tcPr>
+          <w:p>
+            <w:r>
+              <w:t>Grupo 04</w:t>
+            </w:r>
+          </w:p>
+        </w:tc>
+        <w:tc>
+          <w:tcPr>
+            <w:tcW w:type="dxa" w:w="3726"/>
+          </w:tcPr>
+          <w:p>
+            <w:r>
+              <w:t>Adenda v5: Nuevas funcionalidades de frontend y procesamiento (zona de carga PDF, extracción automática IA, carrusel interactivo de demos, desglose detallado de criterios con pesos oficiales y despliegue a Render).</w:t>
             </w:r>
           </w:p>
         </w:tc>
@@ -26451,6 +26498,154 @@
       </w:pPr>
       <w:r>
         <w:t>Sustituir MockLinkedInSource por la API real de LinkedIn Talent Solutions (OAuth), manteniendo la misma interfaz fetch_linkedin_profile() para no romper el contrato de la tool.</w:t>
+      </w:r>
+    </w:p>
+    <w:p>
+      <w:pPr>
+        <w:pStyle w:val="Ttulo1"/>
+      </w:pPr>
+      <w:r>
+        <w:t>Adenda v5 — Nuevas funcionalidades de interfaz y procesamiento de hojas de vida (PDF, Carrusel de Demos y Desglose con Pesos)</w:t>
+      </w:r>
+    </w:p>
+    <w:p>
+      <w:r>
+        <w:t>Esta adenda documenta las mejoras implementadas en la versión v5 del proyecto para dotar al sistema de una interfaz gráfica interactiva, capacidad de carga de hojas de vida en formato PDF con extracción automática por IA, carrusel dinámico de demos y visualización del desglose de criterios con pesos.</w:t>
+      </w:r>
+    </w:p>
+    <w:p>
+      <w:pPr>
+        <w:pStyle w:val="Ttulo2"/>
+      </w:pPr>
+      <w:r>
+        <w:t>A5.1 Ingesta Inteligente de PDFs y extracción con IA (main.py, requirements.txt)</w:t>
+      </w:r>
+    </w:p>
+    <w:p>
+      <w:r>
+        <w:t>Se implementó un nuevo endpoint para permitir la carga y preprocesamiento de CVs en formato PDF:</w:t>
+      </w:r>
+    </w:p>
+    <w:p>
+      <w:pPr>
+        <w:pStyle w:val="Prrafodelista"/>
+      </w:pPr>
+      <w:r>
+        <w:t>requirements.txt: Se agregaron las librerías pypdf (para la lectura y procesamiento local de PDFs), python-multipart y aiofiles (para el manejo asíncrono de carga de archivos en FastAPI).</w:t>
+      </w:r>
+    </w:p>
+    <w:p>
+      <w:pPr>
+        <w:pStyle w:val="Prrafodelista"/>
+      </w:pPr>
+      <w:r>
+        <w:t>Endpoint /parse-cv (main.py): Recibe el archivo PDF enviado desde la UI, lee sus páginas utilizando pypdf, extrae el texto plano y realiza una llamada estructurada al LLM (Groq) con el esquema CandidateProfile para extraer campos como nombre, email, teléfono, posición, años de experiencia, habilidades, educación y DNI automáticamente.</w:t>
+      </w:r>
+    </w:p>
+    <w:p>
+      <w:pPr>
+        <w:pStyle w:val="Ttulo2"/>
+      </w:pPr>
+      <w:r>
+        <w:t>A5.2 Interfaz Gráfica Premium y Carrusel de Demos (static/index.html)</w:t>
+      </w:r>
+    </w:p>
+    <w:p>
+      <w:r>
+        <w:t>Se desarrolló un frontend web SPA moderno en la carpeta static/ que consume de forma asíncrona la API del backend:</w:t>
+      </w:r>
+    </w:p>
+    <w:p>
+      <w:pPr>
+        <w:pStyle w:val="Prrafodelista"/>
+      </w:pPr>
+      <w:r>
+        <w:t>Zona de Carga (Drag &amp; Drop): Habilita arrastrar o seleccionar archivos PDF, mostrando un indicador de progreso de análisis de IA y destellos verdes en los campos del formulario que se auto-rellenan de forma automática.</w:t>
+      </w:r>
+    </w:p>
+    <w:p>
+      <w:pPr>
+        <w:pStyle w:val="Prrafodelista"/>
+      </w:pPr>
+      <w:r>
+        <w:t>Carrusel de Demos Rotativo: Sistema de perfiles precargados (Carlos Mendoza, Ana Rojas, Miguel Torres, Luciana Paredes) que permite probar el flujo con candidatos aprobados, rechazados y frontera. Incluye botones de flechas (‹ y ›), puntos de estado del carrusel y un botón '🎲 Otro demo' que avanza automáticamente.</w:t>
+      </w:r>
+    </w:p>
+    <w:p>
+      <w:pPr>
+        <w:pStyle w:val="Prrafodelista"/>
+      </w:pPr>
+      <w:r>
+        <w:t>Historial de Evaluaciones: Muestra los candidatos evaluados durante la sesión con su clasificación y permite recuperar sus resultados completos instantáneamente con un solo clic.</w:t>
+      </w:r>
+    </w:p>
+    <w:p>
+      <w:pPr>
+        <w:pStyle w:val="Ttulo2"/>
+      </w:pPr>
+      <w:r>
+        <w:t>A5.3 Visualización del Desglose de Criterios y Pesos en la Evaluación</w:t>
+      </w:r>
+    </w:p>
+    <w:p>
+      <w:r>
+        <w:t>Se resolvió la visualización de los resultados estructurados del grafo de reclutamiento:</w:t>
+      </w:r>
+    </w:p>
+    <w:p>
+      <w:pPr>
+        <w:pStyle w:val="Prrafodelista"/>
+      </w:pPr>
+      <w:r>
+        <w:t>Campo breakdown en el Grafo: Se añadió la variable breakdown en RecruitmentState (shared/state.py) y en el retorno del nodo evaluar_clasificar (agents/graph.py) para pasar los puntajes de los criterios de evaluación del LLM.</w:t>
+      </w:r>
+    </w:p>
+    <w:p>
+      <w:pPr>
+        <w:pStyle w:val="Prrafodelista"/>
+      </w:pPr>
+      <w:r>
+        <w:t>Visualización de Pesos oficiales en el Frontend: El desglose en el frontend ahora indica explícitamente el peso de cada criterio según la rúbrica institucional del curso:</w:t>
+      </w:r>
+    </w:p>
+    <w:p>
+      <w:pPr>
+        <w:pStyle w:val="Prrafodelista"/>
+      </w:pPr>
+      <w:r>
+        <w:t xml:space="preserve">  - Habilidades técnicas (35%)</w:t>
+      </w:r>
+    </w:p>
+    <w:p>
+      <w:pPr>
+        <w:pStyle w:val="Prrafodelista"/>
+      </w:pPr>
+      <w:r>
+        <w:t xml:space="preserve">  - Experiencia relevante (30%)</w:t>
+      </w:r>
+    </w:p>
+    <w:p>
+      <w:pPr>
+        <w:pStyle w:val="Prrafodelista"/>
+      </w:pPr>
+      <w:r>
+        <w:t xml:space="preserve">  - Educación (20%)</w:t>
+      </w:r>
+    </w:p>
+    <w:p>
+      <w:pPr>
+        <w:pStyle w:val="Prrafodelista"/>
+      </w:pPr>
+      <w:r>
+        <w:t xml:space="preserve">  - Calidad del CV (15%)</w:t>
+      </w:r>
+    </w:p>
+    <w:p>
+      <w:pPr>
+        <w:pStyle w:val="Prrafodelista"/>
+      </w:pPr>
+      <w:r>
+        <w:t>Anillo de Puntuación Global (Score Ring): Indicador circular SVG dinámico que muestra el score ponderado final utilizando colores semánticos (verde para aprobados &gt;=70, amarillo para frontera 50-69, rojo para rechazados) junto con las fortalezas, brechas y la justificación del LLM.</w:t>
       </w:r>
     </w:p>
     <w:sectPr>

</xml_diff>